<commit_message>
Reconcile 511 vs 517 ambulatory cohort counts in supplementary artifacts
Co-authored-by: dreamcheap2000 <229635625+dreamcheap2000@users.noreply.github.com>
</commit_message>
<xml_diff>
--- a/20260919_Supplementary_Table1.docx
+++ b/20260919_Supplementary_Table1.docx
@@ -11,7 +11,12 @@
           <w:b/>
           <w:sz w:val="22"/>
         </w:rPr>
-        <w:t>Supplementary Table 1. Baseline comparison of completers vs non-completers</w:t>
+        <w:t>Supplementary Table 1. Ambulatory-cohort reconciliation for the 6MWT4 continuous model</w:t>
+      </w:r>
+    </w:p>
+    <w:p>
+      <w:r>
+        <w:t>Source workbook: 20260826_DeID.xlsx. Eligible ambulatory cohort: n=517 (Completed PAC program and 6MWT_Best_Scenario=1). Continuous-model analytic cohort: n=511 (non-missing 6MWT4). Excluded from model: n=6 (missing 6MWT4).</w:t>
       </w:r>
     </w:p>
     <w:tbl>
@@ -51,7 +56,7 @@
                 <w:b/>
                 <w:sz w:val="18"/>
               </w:rPr>
-              <w:t>Completers (n=577)</w:t>
+              <w:t>Model-analytic ambulatory (n=511)</w:t>
             </w:r>
           </w:p>
         </w:tc>
@@ -65,7 +70,7 @@
                 <w:b/>
                 <w:sz w:val="18"/>
               </w:rPr>
-              <w:t>Non-completers (n=56)</w:t>
+              <w:t>Eligible ambulatory excluded (n=6)</w:t>
             </w:r>
           </w:p>
         </w:tc>
@@ -107,7 +112,7 @@
               <w:rPr>
                 <w:sz w:val="18"/>
               </w:rPr>
-              <w:t>64.6 ± 12.6</w:t>
+              <w:t>63.9 ± 12.5</w:t>
             </w:r>
           </w:p>
         </w:tc>
@@ -120,7 +125,7 @@
               <w:rPr>
                 <w:sz w:val="18"/>
               </w:rPr>
-              <w:t>67.1 ± 14.2</w:t>
+              <w:t>64.5 ± 12.1</w:t>
             </w:r>
           </w:p>
         </w:tc>
@@ -133,7 +138,7 @@
               <w:rPr>
                 <w:sz w:val="18"/>
               </w:rPr>
-              <w:t>0.214</w:t>
+              <w:t>0.915</w:t>
             </w:r>
           </w:p>
         </w:tc>
@@ -161,7 +166,7 @@
               <w:rPr>
                 <w:sz w:val="18"/>
               </w:rPr>
-              <w:t>381 (66.0%)</w:t>
+              <w:t>338 (66.1%)</w:t>
             </w:r>
           </w:p>
         </w:tc>
@@ -174,7 +179,7 @@
               <w:rPr>
                 <w:sz w:val="18"/>
               </w:rPr>
-              <w:t>41 (73.2%)</w:t>
+              <w:t>3 (50.0%)</w:t>
             </w:r>
           </w:p>
         </w:tc>
@@ -187,7 +192,7 @@
               <w:rPr>
                 <w:sz w:val="18"/>
               </w:rPr>
-              <w:t>0.302</w:t>
+              <w:t>0.414</w:t>
             </w:r>
           </w:p>
         </w:tc>
@@ -215,7 +220,7 @@
               <w:rPr>
                 <w:sz w:val="18"/>
               </w:rPr>
-              <w:t>493 (85.4%)</w:t>
+              <w:t>435 (85.1%)</w:t>
             </w:r>
           </w:p>
         </w:tc>
@@ -228,7 +233,7 @@
               <w:rPr>
                 <w:sz w:val="18"/>
               </w:rPr>
-              <w:t>55 (98.2%)</w:t>
+              <w:t>5 (83.3%)</w:t>
             </w:r>
           </w:p>
         </w:tc>
@@ -241,7 +246,7 @@
               <w:rPr>
                 <w:sz w:val="18"/>
               </w:rPr>
-              <w:t>0.004</w:t>
+              <w:t>1.000</w:t>
             </w:r>
           </w:p>
         </w:tc>
@@ -269,7 +274,7 @@
               <w:rPr>
                 <w:sz w:val="18"/>
               </w:rPr>
-              <w:t>50.0 [35.0, 60.0]</w:t>
+              <w:t>50.0 [40.0, 60.0]</w:t>
             </w:r>
           </w:p>
         </w:tc>
@@ -282,7 +287,7 @@
               <w:rPr>
                 <w:sz w:val="18"/>
               </w:rPr>
-              <w:t>45.0 [30.0, 55.0]</w:t>
+              <w:t>47.5 [41.2, 50.0]</w:t>
             </w:r>
           </w:p>
         </w:tc>
@@ -295,7 +300,7 @@
               <w:rPr>
                 <w:sz w:val="18"/>
               </w:rPr>
-              <w:t>0.093</w:t>
+              <w:t>0.492</w:t>
             </w:r>
           </w:p>
         </w:tc>
@@ -323,7 +328,7 @@
               <w:rPr>
                 <w:sz w:val="18"/>
               </w:rPr>
-              <w:t>29.3 ± 17.3</w:t>
+              <w:t>31.7 ± 16.4</w:t>
             </w:r>
           </w:p>
         </w:tc>
@@ -336,7 +341,7 @@
               <w:rPr>
                 <w:sz w:val="18"/>
               </w:rPr>
-              <w:t>20.0 ± 18.2</w:t>
+              <w:t>33.0 ± 11.0</w:t>
             </w:r>
           </w:p>
         </w:tc>
@@ -349,7 +354,7 @@
               <w:rPr>
                 <w:sz w:val="18"/>
               </w:rPr>
-              <w:t>&lt;0.001</w:t>
+              <w:t>0.809</w:t>
             </w:r>
           </w:p>
         </w:tc>
@@ -390,7 +395,7 @@
               <w:rPr>
                 <w:sz w:val="18"/>
               </w:rPr>
-              <w:t>7.0 [4.0, 10.2]</w:t>
+              <w:t>5.5 [4.2, 6.0]</w:t>
             </w:r>
           </w:p>
         </w:tc>
@@ -403,7 +408,7 @@
               <w:rPr>
                 <w:sz w:val="18"/>
               </w:rPr>
-              <w:t>0.191</w:t>
+              <w:t>0.399</w:t>
             </w:r>
           </w:p>
         </w:tc>
@@ -431,7 +436,7 @@
               <w:rPr>
                 <w:sz w:val="18"/>
               </w:rPr>
-              <w:t>5.0 [3.0, 7.0]</w:t>
+              <w:t>5.0 [3.0, 6.0]</w:t>
             </w:r>
           </w:p>
         </w:tc>
@@ -444,7 +449,7 @@
               <w:rPr>
                 <w:sz w:val="18"/>
               </w:rPr>
-              <w:t>5.0 [4.0, 7.2]</w:t>
+              <w:t>6.0 [5.2, 6.8]</w:t>
             </w:r>
           </w:p>
         </w:tc>
@@ -457,7 +462,7 @@
               <w:rPr>
                 <w:sz w:val="18"/>
               </w:rPr>
-              <w:t>0.119</w:t>
+              <w:t>0.283</w:t>
             </w:r>
           </w:p>
         </w:tc>
@@ -485,7 +490,7 @@
               <w:rPr>
                 <w:sz w:val="18"/>
               </w:rPr>
-              <w:t>16 (2.8%)</w:t>
+              <w:t>16 (3.1%)</w:t>
             </w:r>
           </w:p>
         </w:tc>
@@ -498,7 +503,7 @@
               <w:rPr>
                 <w:sz w:val="18"/>
               </w:rPr>
-              <w:t>3 (5.4%)</w:t>
+              <w:t>0 (0.0%)</w:t>
             </w:r>
           </w:p>
         </w:tc>
@@ -511,7 +516,7 @@
               <w:rPr>
                 <w:sz w:val="18"/>
               </w:rPr>
-              <w:t>0.232</w:t>
+              <w:t>1.000</w:t>
             </w:r>
           </w:p>
         </w:tc>
@@ -519,7 +524,7 @@
     </w:tbl>
     <w:p>
       <w:r>
-        <w:t>Continuous mean±SD variables were compared with Welch t-test; median [IQR] variables with Mann–Whitney U test; categorical variables with Fisher's exact test. Ischemic stroke etiology was derived as HemorrhageStroke=0. Admission/discharge NIHSS were computed as sums of NIHSS item scores (In/Out components).</w:t>
+        <w:t>Continuous mean±SD variables were compared with Welch t-test; median [IQR] variables with Mann–Whitney U test; categorical variables with Fisher's exact test. Ischemic stroke etiology was derived as HemorrhageStroke=0. Admission/discharge NIHSS were computed as sums of NIHSS item scores (In/Out components). Cohort reconciliation: 517 eligible ambulatory participants = 511 model-analytic + 6 excluded for missing 6MWT4. Excluded IDs (de-identified): 107,112,208,257,458,550. Record-level audit: 20260919_Supplementary_Table1_Cohort_Reconciliation.csv; metadata: 20260919_Supplementary_Table1_Cohort_Metadata.csv.</w:t>
       </w:r>
     </w:p>
     <w:sectPr>

</xml_diff>